<commit_message>
Week 11: update sync, fix bugs, add image upload, add report
</commit_message>
<xml_diff>
--- a/2224802010933_tuan10.docx
+++ b/2224802010933_tuan10.docx
@@ -80,6 +80,11 @@
     <w:p>
       <w:r>
         <w:t>Chi tiết trong github ạ.</w:t>
+      </w:r>
+    </w:p>
+    <w:p>
+      <w:r>
+        <w:t>https://github.com/BaoSonPie/2224802010933_sobanhang_final.git</w:t>
       </w:r>
     </w:p>
     <w:sectPr>

</xml_diff>